<commit_message>
v1.0.1: add Zenodo DOI 10.5281/zenodo.23562193 to PDF, DOCX, README and citation metadata
</commit_message>
<xml_diff>
--- a/Bourguet_2026_Better_Ancestors_preprint_v1.docx
+++ b/Bourguet_2026_Better_Ancestors_preprint_v1.docx
@@ -72,7 +72,7 @@
                 <w:color w:val="B03A2E"/>
                 <w:sz w:val="18"/>
               </w:rPr>
-              <w:t>Version 1 · 22 October 2026 · Under double-anonymous peer review at a journal (venue withheld) · Not yet peer reviewed · CC BY 4.0</w:t>
+              <w:t>Version 1 · 22 October 2026 · Under double-anonymous peer review at a journal (venue withheld) · Not yet peer reviewed · CC BY 4.0 · DOI 10.5281/zenodo.23562193</w:t>
             </w:r>
           </w:p>
         </w:tc>
@@ -1732,7 +1732,24 @@
         </w:r>
       </w:hyperlink>
       <w:r>
-        <w:t xml:space="preserve">. Archived version and DOI: see the Zenodo record linked from the repository</w:t>
+        <w:t xml:space="preserve">. Archived at Zenodo:</w:t>
+      </w:r>
+      <w:r>
+        <w:t xml:space="preserve"> </w:t>
+      </w:r>
+      <w:hyperlink r:id="rId22">
+        <w:r>
+          <w:rPr>
+            <w:rStyle w:val="Hyperlink"/>
+          </w:rPr>
+          <w:t xml:space="preserve">doi:10.5281/zenodo.23562193</w:t>
+        </w:r>
+      </w:hyperlink>
+      <w:r>
+        <w:t xml:space="preserve"> </w:t>
+      </w:r>
+      <w:r>
+        <w:t xml:space="preserve">(all versions); source and code in the repository</w:t>
       </w:r>
       <w:r>
         <w:t xml:space="preserve"> </w:t>
@@ -1765,7 +1782,7 @@
         <w:t xml:space="preserve">emergence; transgenerationality; documentality; constitutional endurance; Better Ancestors Principle</w:t>
       </w:r>
     </w:p>
-    <w:bookmarkStart w:id="22" w:name="X88e65be3c18f4fc35f39432ed555ed18730dd0b"/>
+    <w:bookmarkStart w:id="23" w:name="X88e65be3c18f4fc35f39432ed555ed18730dd0b"/>
     <w:p>
       <w:pPr>
         <w:pStyle w:val="Heading2"/>
@@ -1814,8 +1831,8 @@
         <w:t xml:space="preserve">The argument runs as follows. Section 1 describes the constitution as an order of inscribed linguistic acts — norms, procedures of re-inscription and a regime that staffs them — and shows why the contract model cannot account for the bond. Section 2 identifies transgenerationality as its characteristic emergent property and types the emergence as diachronic, ontological and weak. Section 3 rereads the design covariates of endurance research as properties of the inscription regime and argues that authoritative interpretation is a channel of re-inscription. Section 4 defines the Principle; Section 5 defines the ranking and computes it for a hypothetical order. Section 6 states the limits of the construct and what applying it would require. The article is conceptual: it defines and illustrates, and codes no existing order.</w:t>
       </w:r>
     </w:p>
-    <w:bookmarkEnd w:id="22"/>
-    <w:bookmarkStart w:id="23" w:name="X8bf8d5471965bcf065215b5269bf0d5d20015b0"/>
+    <w:bookmarkEnd w:id="23"/>
+    <w:bookmarkStart w:id="24" w:name="X8bf8d5471965bcf065215b5269bf0d5d20015b0"/>
     <w:p>
       <w:pPr>
         <w:pStyle w:val="Heading2"/>
@@ -1872,8 +1889,8 @@
         <w:t xml:space="preserve">Documentality removes the contract’s synchronic limit without solving its problem. An inscribed act does not need its authors to be present in order to bind; that is what inscription is for. But this shows only that an order can bind those who did not consent, not that it may, nor on what terms. A constitution is the strong document that binds the largest number of persons who took no part in its inscription: every later generation of the people it constitutes. The documentary picture explains how that bond is possible. It does not say what kind of property the bond is, nor what an order owes those it binds. The first question is Section 2’s; the second belongs to Sections 4 and 5.</w:t>
       </w:r>
     </w:p>
-    <w:bookmarkEnd w:id="23"/>
-    <w:bookmarkStart w:id="24" w:name="X3200c560e74a0118855c29de37b4ca963e49c57"/>
+    <w:bookmarkEnd w:id="24"/>
+    <w:bookmarkStart w:id="25" w:name="X3200c560e74a0118855c29de37b4ca963e49c57"/>
     <w:p>
       <w:pPr>
         <w:pStyle w:val="Heading2"/>
@@ -1984,8 +2001,8 @@
         <w:t xml:space="preserve">One distinction from Andina frames that task. A future generation can be treated regulatively, as an ideal the present orders its action towards, or conservatively, as the party that will complete what the present decides without being consulted (2020: 87-91). As inscribed, a constitution is the conservative transgenerational action par excellence. Whether it remains so is not settled by its text: it depends on whether those it binds can re-inscribe it, and on who else can. Section 3 locates that question in the inscription regime.</w:t>
       </w:r>
     </w:p>
-    <w:bookmarkEnd w:id="24"/>
-    <w:bookmarkStart w:id="25" w:name="Xaa9eccb1479c2385fbbf3c470394920ca8392fa"/>
+    <w:bookmarkEnd w:id="25"/>
+    <w:bookmarkStart w:id="26" w:name="Xaa9eccb1479c2385fbbf3c470394920ca8392fa"/>
     <w:p>
       <w:pPr>
         <w:pStyle w:val="Heading2"/>
@@ -2089,8 +2106,8 @@
         <w:t xml:space="preserve">The regime reading separates two questions the design reading runs together. Whether an order lasts depends, among other things, on how much change its routes can absorb; whether it is a good ancestor depends on who holds those routes. An order can endure precisely because its re-inscription has been displaced to bodies its bound generations cannot reach, and endurance of that kind is the rule of the dead over the living by institutional means. The capacity to last, as Andina puts it, is not of itself a sign of social growth (2020: 141). What the bound generation needs is not that the order last, nor that it lapse, but that every bond it inherits remain open to re-inscription under its own control. Section 4 makes that condition exact.</w:t>
       </w:r>
     </w:p>
-    <w:bookmarkEnd w:id="25"/>
-    <w:bookmarkStart w:id="26" w:name="X94d8a6e0a2b6a0d87177502a379f58588c4c953"/>
+    <w:bookmarkEnd w:id="26"/>
+    <w:bookmarkStart w:id="27" w:name="X94d8a6e0a2b6a0d87177502a379f58588c4c953"/>
     <w:p>
       <w:pPr>
         <w:pStyle w:val="Heading2"/>
@@ -2410,8 +2427,8 @@
         <w:t xml:space="preserve">Two definitions a reader might have expected are set aside. A principle of non-diminishment — no generation may leave its successors less re-inscription capacity than it enjoyed — governs acts rather than designs and can rank orders only once they have a history; a distributive principle — rank orders by the capacity left to their worst-placed generation — makes openness the good and cannot say why an order that lapses with each generation is not the best ancestor of all. Neither registers who else controls inscription; both survive in Section 5 as corollaries of Definition 5.</w:t>
       </w:r>
     </w:p>
-    <w:bookmarkEnd w:id="26"/>
-    <w:bookmarkStart w:id="27" w:name="X43262da2927eb0efecd3b29bb62b3672510c808"/>
+    <w:bookmarkEnd w:id="27"/>
+    <w:bookmarkStart w:id="28" w:name="X43262da2927eb0efecd3b29bb62b3672510c808"/>
     <w:p>
       <w:pPr>
         <w:pStyle w:val="Heading2"/>
@@ -3105,8 +3122,8 @@
         <w:t xml:space="preserve">; every formal amendment procedure with its stages, bodies, thresholds, scope and exclusions; every body holding final interpretive authority and the articles it covers; and, for each body named, how its seats fall vacant and who fills them, which fixes access. Together these fix both conditions. The first two items are text; the last two are facts about the regime. On text alone no verdict is final — an eternity clause fails (i) only if the regime leaves its reading beyond the bound generation, and every order without one ties at V = 0 — so the discriminating power of the ranking lies in the regime, which is also where the re-inscription rule locates constitutional change. This article computes the ratio for Ω only; applying the checklist to existing orders, whose amendment procedures and interpreting bodies the comparative literature documents, is a task the definitions make possible and this article does not undertake.</w:t>
       </w:r>
     </w:p>
-    <w:bookmarkEnd w:id="27"/>
-    <w:bookmarkStart w:id="28" w:name="coda-limits-and-horizon"/>
+    <w:bookmarkEnd w:id="28"/>
+    <w:bookmarkStart w:id="29" w:name="coda-limits-and-horizon"/>
     <w:p>
       <w:pPr>
         <w:pStyle w:val="Heading2"/>
@@ -3155,8 +3172,8 @@
         <w:t xml:space="preserve">A good ancestor, on this account, is not one whose order lasts, but one whose order its descendants can still re-inscribe under their own control.</w:t>
       </w:r>
     </w:p>
-    <w:bookmarkEnd w:id="28"/>
-    <w:bookmarkStart w:id="29" w:name="references"/>
+    <w:bookmarkEnd w:id="29"/>
+    <w:bookmarkStart w:id="30" w:name="references"/>
     <w:p>
       <w:pPr>
         <w:pStyle w:val="Heading2"/>
@@ -3341,7 +3358,7 @@
         <w:t xml:space="preserve">Thomasson, Amie L. (1999), Fiction and Metaphysics, Cambridge, Cambridge University Press.</w:t>
       </w:r>
     </w:p>
-    <w:bookmarkEnd w:id="29"/>
+    <w:bookmarkEnd w:id="30"/>
     <w:sectPr>
       <w:headerReference w:type="default" r:id="rId9"/>
     </w:sectPr>
@@ -3385,7 +3402,7 @@
         <w:color w:val="B03A2E"/>
         <w:sz w:val="16"/>
       </w:rPr>
-      <w:t>PREPRINT · under peer review, not yet peer reviewed · October 2026</w:t>
+      <w:t>PREPRINT · under peer review, not yet peer reviewed · October 2026 · doi:10.5281/zenodo.23562193</w:t>
     </w:r>
   </w:p>
 </w:hdr>

</xml_diff>